<commit_message>
Update report to contain section on parametric polymorphism
</commit_message>
<xml_diff>
--- a/report/report.docx
+++ b/report/report.docx
@@ -975,7 +975,21 @@
           <w:sz w:val="28"/>
           <w:szCs w:val="28"/>
         </w:rPr>
-        <w:t>Key game functionality can be implemented with mathematical matrix functions which are pure, granular, and reusable.</w:t>
+        <w:t xml:space="preserve">Key game functionality can be implemented with mathematical matrix functions which are </w:t>
+      </w:r>
+      <w:r>
+        <w:rPr>
+          <w:sz w:val="28"/>
+          <w:szCs w:val="28"/>
+        </w:rPr>
+        <w:t>granular and pure</w:t>
+      </w:r>
+      <w:r>
+        <w:rPr>
+          <w:sz w:val="28"/>
+          <w:szCs w:val="28"/>
+        </w:rPr>
+        <w:t>.</w:t>
       </w:r>
     </w:p>
     <w:p>
@@ -997,6 +1011,96 @@
         </w:rPr>
         <w:lastRenderedPageBreak/>
         <w:t>Matrices are scalable and matrix functions are reusable, meaning the game can be easily expanded to accommodate different blocks and board sizes.</w:t>
+      </w:r>
+    </w:p>
+    <w:p>
+      <w:pPr>
+        <w:pStyle w:val="ListParagraph"/>
+        <w:numPr>
+          <w:ilvl w:val="0"/>
+          <w:numId w:val="1"/>
+        </w:numPr>
+        <w:rPr>
+          <w:sz w:val="28"/>
+          <w:szCs w:val="28"/>
+        </w:rPr>
+      </w:pPr>
+      <w:r>
+        <w:rPr>
+          <w:sz w:val="28"/>
+          <w:szCs w:val="28"/>
+        </w:rPr>
+        <w:t>Matri</w:t>
+      </w:r>
+      <w:r>
+        <w:rPr>
+          <w:sz w:val="28"/>
+          <w:szCs w:val="28"/>
+        </w:rPr>
+        <w:t>x definitions</w:t>
+      </w:r>
+      <w:r>
+        <w:rPr>
+          <w:sz w:val="28"/>
+          <w:szCs w:val="28"/>
+        </w:rPr>
+        <w:t xml:space="preserve"> can be written with generic types, meaning functions </w:t>
+      </w:r>
+      <w:r>
+        <w:rPr>
+          <w:sz w:val="28"/>
+          <w:szCs w:val="28"/>
+        </w:rPr>
+        <w:t xml:space="preserve">and data structures </w:t>
+      </w:r>
+      <w:r>
+        <w:rPr>
+          <w:sz w:val="28"/>
+          <w:szCs w:val="28"/>
+        </w:rPr>
+        <w:t xml:space="preserve">can take advantage of </w:t>
+      </w:r>
+      <w:r>
+        <w:rPr>
+          <w:sz w:val="28"/>
+          <w:szCs w:val="28"/>
+        </w:rPr>
+        <w:t>parametric</w:t>
+      </w:r>
+      <w:r>
+        <w:rPr>
+          <w:sz w:val="28"/>
+          <w:szCs w:val="28"/>
+        </w:rPr>
+        <w:t xml:space="preserve"> polymorphism and be </w:t>
+      </w:r>
+      <w:r>
+        <w:rPr>
+          <w:sz w:val="28"/>
+          <w:szCs w:val="28"/>
+        </w:rPr>
+        <w:t>reusable</w:t>
+      </w:r>
+      <w:r>
+        <w:rPr>
+          <w:sz w:val="28"/>
+          <w:szCs w:val="28"/>
+        </w:rPr>
+        <w:t xml:space="preserve"> </w:t>
+      </w:r>
+      <w:r>
+        <w:rPr>
+          <w:sz w:val="28"/>
+          <w:szCs w:val="28"/>
+        </w:rPr>
+        <w:t>on</w:t>
+      </w:r>
+      <w:r>
+        <w:rPr>
+          <w:sz w:val="28"/>
+          <w:szCs w:val="28"/>
+        </w:rPr>
+        <w:t xml:space="preserve"> matrices of any type.</w:t>
       </w:r>
     </w:p>
     <w:p>

</xml_diff>

<commit_message>
Add references to report
</commit_message>
<xml_diff>
--- a/report/report.docx
+++ b/report/report.docx
@@ -1304,102 +1304,122 @@
           <w:szCs w:val="28"/>
         </w:rPr>
       </w:pPr>
-    </w:p>
-    <w:p>
-      <w:pPr>
-        <w:rPr>
-          <w:sz w:val="28"/>
-          <w:szCs w:val="28"/>
-        </w:rPr>
-      </w:pPr>
-    </w:p>
-    <w:p>
-      <w:pPr>
-        <w:rPr>
-          <w:sz w:val="28"/>
-          <w:szCs w:val="28"/>
-        </w:rPr>
-      </w:pPr>
-    </w:p>
-    <w:p>
-      <w:pPr>
-        <w:rPr>
-          <w:sz w:val="28"/>
-          <w:szCs w:val="28"/>
-        </w:rPr>
-      </w:pPr>
-    </w:p>
-    <w:p>
-      <w:pPr>
-        <w:rPr>
-          <w:sz w:val="28"/>
-          <w:szCs w:val="28"/>
-        </w:rPr>
-      </w:pPr>
-    </w:p>
-    <w:p>
-      <w:pPr>
-        <w:rPr>
-          <w:sz w:val="28"/>
-          <w:szCs w:val="28"/>
-        </w:rPr>
-      </w:pPr>
-    </w:p>
-    <w:p>
-      <w:pPr>
-        <w:rPr>
-          <w:sz w:val="28"/>
-          <w:szCs w:val="28"/>
-        </w:rPr>
-      </w:pPr>
-    </w:p>
-    <w:p>
-      <w:pPr>
-        <w:rPr>
-          <w:sz w:val="28"/>
-          <w:szCs w:val="28"/>
-        </w:rPr>
-      </w:pPr>
-    </w:p>
-    <w:p>
-      <w:pPr>
-        <w:rPr>
-          <w:sz w:val="28"/>
-          <w:szCs w:val="28"/>
-        </w:rPr>
-      </w:pPr>
-    </w:p>
-    <w:p>
-      <w:pPr>
-        <w:rPr>
-          <w:sz w:val="28"/>
-          <w:szCs w:val="28"/>
-        </w:rPr>
-      </w:pPr>
-    </w:p>
-    <w:p>
-      <w:pPr>
-        <w:rPr>
-          <w:sz w:val="28"/>
-          <w:szCs w:val="28"/>
-        </w:rPr>
-      </w:pPr>
-    </w:p>
-    <w:p>
-      <w:pPr>
-        <w:rPr>
-          <w:sz w:val="28"/>
-          <w:szCs w:val="28"/>
-        </w:rPr>
-      </w:pPr>
-    </w:p>
-    <w:p>
-      <w:pPr>
-        <w:rPr>
-          <w:sz w:val="28"/>
-          <w:szCs w:val="28"/>
-        </w:rPr>
-      </w:pPr>
+      <w:r>
+        <w:rPr>
+          <w:sz w:val="28"/>
+          <w:szCs w:val="28"/>
+        </w:rPr>
+        <w:t>References</w:t>
+      </w:r>
+    </w:p>
+    <w:p>
+      <w:pPr>
+        <w:rPr>
+          <w:sz w:val="22"/>
+          <w:szCs w:val="22"/>
+        </w:rPr>
+      </w:pPr>
+    </w:p>
+    <w:p>
+      <w:pPr>
+        <w:rPr>
+          <w:lang w:eastAsia="en-GB"/>
+        </w:rPr>
+      </w:pPr>
+      <w:r>
+        <w:rPr>
+          <w:lang w:eastAsia="en-GB"/>
+        </w:rPr>
+        <w:t>Dwyer, T. (2023, September 3). Asteroids2023</w:t>
+      </w:r>
+    </w:p>
+    <w:p>
+      <w:pPr>
+        <w:rPr>
+          <w:lang w:eastAsia="en-GB"/>
+        </w:rPr>
+      </w:pPr>
+      <w:hyperlink r:id="rId7" w:history="1">
+        <w:r>
+          <w:rPr>
+            <w:rStyle w:val="Hyperlink"/>
+            <w:lang w:eastAsia="en-GB"/>
+          </w:rPr>
+          <w:t>https://stackblitz.com/edit/asteroids2023</w:t>
+        </w:r>
+      </w:hyperlink>
+    </w:p>
+    <w:p>
+      <w:pPr>
+        <w:rPr>
+          <w:lang w:eastAsia="en-GB"/>
+        </w:rPr>
+      </w:pPr>
+    </w:p>
+    <w:p>
+      <w:pPr>
+        <w:rPr>
+          <w:lang w:eastAsia="en-GB"/>
+        </w:rPr>
+      </w:pPr>
+      <w:r>
+        <w:rPr>
+          <w:lang w:eastAsia="en-GB"/>
+        </w:rPr>
+        <w:t>Dwyer, T. (2023, August 28). Tim's Code Stuff. FRP Asteroids.</w:t>
+      </w:r>
+    </w:p>
+    <w:p>
+      <w:pPr>
+        <w:rPr>
+          <w:lang w:eastAsia="en-GB"/>
+        </w:rPr>
+      </w:pPr>
+      <w:hyperlink r:id="rId8" w:history="1">
+        <w:r>
+          <w:rPr>
+            <w:rStyle w:val="Hyperlink"/>
+            <w:lang w:eastAsia="en-GB"/>
+          </w:rPr>
+          <w:t>https://tgdwyer.github.io/asteroids/</w:t>
+        </w:r>
+      </w:hyperlink>
+    </w:p>
+    <w:p>
+      <w:pPr>
+        <w:rPr>
+          <w:lang w:eastAsia="en-GB"/>
+        </w:rPr>
+      </w:pPr>
+    </w:p>
+    <w:p>
+      <w:pPr>
+        <w:rPr>
+          <w:lang w:eastAsia="en-GB"/>
+        </w:rPr>
+      </w:pPr>
+      <w:r>
+        <w:rPr>
+          <w:lang w:eastAsia="en-GB"/>
+        </w:rPr>
+        <w:t>Dwyer, T. (2023, August 28). Tim's Code Stuff. Functional Reactive Programming</w:t>
+      </w:r>
+    </w:p>
+    <w:p>
+      <w:pPr>
+        <w:rPr>
+          <w:lang w:eastAsia="en-GB"/>
+        </w:rPr>
+      </w:pPr>
+      <w:hyperlink r:id="rId9" w:history="1">
+        <w:r>
+          <w:rPr>
+            <w:rStyle w:val="Hyperlink"/>
+            <w:lang w:eastAsia="en-GB"/>
+          </w:rPr>
+          <w:t>https://tgdwyer.github.io/asteroids/</w:t>
+        </w:r>
+      </w:hyperlink>
     </w:p>
     <w:sectPr>
       <w:pgSz w:w="11906" w:h="16838"/>
@@ -2062,6 +2082,29 @@
     <w:uiPriority w:val="99"/>
     <w:rsid w:val="00787ECF"/>
   </w:style>
+  <w:style w:type="character" w:styleId="Hyperlink">
+    <w:name w:val="Hyperlink"/>
+    <w:basedOn w:val="DefaultParagraphFont"/>
+    <w:uiPriority w:val="99"/>
+    <w:unhideWhenUsed/>
+    <w:rsid w:val="005A4AF3"/>
+    <w:rPr>
+      <w:color w:val="0563C1" w:themeColor="hyperlink"/>
+      <w:u w:val="single"/>
+    </w:rPr>
+  </w:style>
+  <w:style w:type="character" w:styleId="UnresolvedMention">
+    <w:name w:val="Unresolved Mention"/>
+    <w:basedOn w:val="DefaultParagraphFont"/>
+    <w:uiPriority w:val="99"/>
+    <w:semiHidden/>
+    <w:unhideWhenUsed/>
+    <w:rsid w:val="005A4AF3"/>
+    <w:rPr>
+      <w:color w:val="605E5C"/>
+      <w:shd w:val="clear" w:color="auto" w:fill="E1DFDD"/>
+    </w:rPr>
+  </w:style>
 </w:styles>
 </file>
 

</xml_diff>